<commit_message>
UI redesign phase 1
</commit_message>
<xml_diff>
--- a/Osei_Acquah_Resume.docx
+++ b/Osei_Acquah_Resume.docx
@@ -158,17 +158,50 @@
           <w:szCs w:val="19"/>
         </w:rPr>
         <w:tab/>
-        <w:t>Expected May 2028</w:t>
-      </w:r>
-    </w:p>
-    <w:p>
-      <w:pPr>
-        <w:spacing w:before="30" w:after="20"/>
-      </w:pPr>
+      </w:r>
       <w:r>
         <w:rPr>
           <w:b/>
           <w:bCs/>
+          <w:i/>
+          <w:iCs/>
+          <w:color w:val="555555"/>
+          <w:sz w:val="19"/>
+          <w:szCs w:val="19"/>
+        </w:rPr>
+        <w:t>GPA: 3.8</w:t>
+      </w:r>
+      <w:r>
+        <w:rPr>
+          <w:b/>
+          <w:bCs/>
+          <w:i/>
+          <w:iCs/>
+          <w:color w:val="555555"/>
+          <w:sz w:val="19"/>
+          <w:szCs w:val="19"/>
+        </w:rPr>
+        <w:t>/4.0</w:t>
+      </w:r>
+      <w:r>
+        <w:rPr>
+          <w:i/>
+          <w:iCs/>
+          <w:color w:val="555555"/>
+          <w:sz w:val="19"/>
+          <w:szCs w:val="19"/>
+        </w:rPr>
+        <w:t xml:space="preserve">              </w:t>
+      </w:r>
+    </w:p>
+    <w:p>
+      <w:pPr>
+        <w:spacing w:before="30" w:after="20"/>
+      </w:pPr>
+      <w:r>
+        <w:rPr>
+          <w:b/>
+          <w:bCs/>
           <w:sz w:val="19"/>
           <w:szCs w:val="19"/>
         </w:rPr>
@@ -179,7 +212,35 @@
           <w:sz w:val="19"/>
           <w:szCs w:val="19"/>
         </w:rPr>
-        <w:t>Foundations of Data Science, Data Structures &amp; Algorithms, OOP, Calc III, Computer Systems</w:t>
+        <w:t>Algorithm analysis,</w:t>
+      </w:r>
+      <w:r>
+        <w:rPr>
+          <w:sz w:val="19"/>
+          <w:szCs w:val="19"/>
+        </w:rPr>
+        <w:t xml:space="preserve"> </w:t>
+      </w:r>
+      <w:r>
+        <w:rPr>
+          <w:sz w:val="19"/>
+          <w:szCs w:val="19"/>
+        </w:rPr>
+        <w:t xml:space="preserve"> Probability</w:t>
+      </w:r>
+      <w:r>
+        <w:rPr>
+          <w:sz w:val="19"/>
+          <w:szCs w:val="19"/>
+        </w:rPr>
+        <w:t xml:space="preserve">, Calc III, </w:t>
+      </w:r>
+      <w:r>
+        <w:rPr>
+          <w:sz w:val="19"/>
+          <w:szCs w:val="19"/>
+        </w:rPr>
+        <w:t>Differential Equations and Modelling</w:t>
       </w:r>
     </w:p>
     <w:p>
@@ -521,7 +582,15 @@
           <w:bCs/>
           <w:color w:val="000000"/>
         </w:rPr>
-        <w:t>UCLA DataFest 2025 (Savills Dataset) — Data Analysis</w:t>
+        <w:t>UCLA DataFest 2025 (Savills Dataset) —</w:t>
+      </w:r>
+      <w:r>
+        <w:rPr>
+          <w:b/>
+          <w:bCs/>
+          <w:color w:val="000000"/>
+        </w:rPr>
+        <w:t xml:space="preserve"> Statistics</w:t>
       </w:r>
       <w:r>
         <w:rPr>

</xml_diff>